<commit_message>
court(gactapp) motion-brief docx: TeX Gyre Schola (DEF-FONT-002), continuous footnote numbering, bullets in the body face, exact line heights (no text in the top margin); docx check green (fb-595.59)
</commit_message>
<xml_diff>
--- a/courts/eleventh-circuit/georgia/state/court-of-appeals/motion-brief/docx/reference.docx
+++ b/courts/eleventh-circuit/georgia/state/court-of-appeals/motion-brief/docx/reference.docx
@@ -7,9 +7,7 @@
         <w:pStyle w:val="Title"/>
       </w:pPr>
       <w:r>
-        <w:t xml:space="preserve">
-Title
-</w:t>
+        <w:t xml:space="preserve">Title</w:t>
       </w:r>
     </w:p>
     <w:p>
@@ -17,9 +15,7 @@
         <w:pStyle w:val="Subtitle"/>
       </w:pPr>
       <w:r>
-        <w:t xml:space="preserve">
-Subtitle
-</w:t>
+        <w:t xml:space="preserve">Subtitle</w:t>
       </w:r>
     </w:p>
     <w:p>
@@ -27,9 +23,7 @@
         <w:pStyle w:val="Author"/>
       </w:pPr>
       <w:r>
-        <w:t xml:space="preserve">
-Author
-</w:t>
+        <w:t xml:space="preserve">Author</w:t>
       </w:r>
     </w:p>
     <w:p>
@@ -37,9 +31,7 @@
         <w:pStyle w:val="Date"/>
       </w:pPr>
       <w:r>
-        <w:t xml:space="preserve">
-Date
-</w:t>
+        <w:t xml:space="preserve">Date</w:t>
       </w:r>
     </w:p>
     <w:p>
@@ -47,9 +39,7 @@
         <w:pStyle w:val="Abstract"/>
       </w:pPr>
       <w:r>
-        <w:t xml:space="preserve">
-Abstract
-</w:t>
+        <w:t xml:space="preserve">Abstract</w:t>
       </w:r>
     </w:p>
     <w:p>
@@ -58,9 +48,7 @@
       </w:pPr>
       <w:bookmarkStart w:id="21" w:name="heading-1"/>
       <w:r>
-        <w:t xml:space="preserve">
-Heading 1
-</w:t>
+        <w:t xml:space="preserve">Heading 1</w:t>
       </w:r>
       <w:bookmarkEnd w:id="21"/>
     </w:p>
@@ -70,9 +58,7 @@
       </w:pPr>
       <w:bookmarkStart w:id="22" w:name="heading-2"/>
       <w:r>
-        <w:t xml:space="preserve">
-Heading 2
-</w:t>
+        <w:t xml:space="preserve">Heading 2</w:t>
       </w:r>
       <w:bookmarkEnd w:id="22"/>
     </w:p>
@@ -82,9 +68,7 @@
       </w:pPr>
       <w:bookmarkStart w:id="23" w:name="heading-3"/>
       <w:r>
-        <w:t xml:space="preserve">
-Heading 3
-</w:t>
+        <w:t xml:space="preserve">Heading 3</w:t>
       </w:r>
       <w:bookmarkEnd w:id="23"/>
     </w:p>
@@ -94,9 +78,7 @@
       </w:pPr>
       <w:bookmarkStart w:id="24" w:name="heading-4"/>
       <w:r>
-        <w:t xml:space="preserve">
-Heading 4
-</w:t>
+        <w:t xml:space="preserve">Heading 4</w:t>
       </w:r>
       <w:bookmarkEnd w:id="24"/>
     </w:p>
@@ -106,9 +88,7 @@
       </w:pPr>
       <w:bookmarkStart w:id="25" w:name="heading-5"/>
       <w:r>
-        <w:t xml:space="preserve">
-Heading 5
-</w:t>
+        <w:t xml:space="preserve">Heading 5</w:t>
       </w:r>
       <w:bookmarkEnd w:id="25"/>
     </w:p>
@@ -118,9 +98,7 @@
       </w:pPr>
       <w:bookmarkStart w:id="26" w:name="heading-6"/>
       <w:r>
-        <w:t xml:space="preserve">
-Heading 6
-</w:t>
+        <w:t xml:space="preserve">Heading 6</w:t>
       </w:r>
       <w:bookmarkEnd w:id="26"/>
     </w:p>
@@ -130,9 +108,7 @@
       </w:pPr>
       <w:bookmarkStart w:id="27" w:name="heading-7"/>
       <w:r>
-        <w:t xml:space="preserve">
-Heading 7
-</w:t>
+        <w:t xml:space="preserve">Heading 7</w:t>
       </w:r>
       <w:bookmarkEnd w:id="27"/>
     </w:p>
@@ -142,9 +118,7 @@
       </w:pPr>
       <w:bookmarkStart w:id="28" w:name="heading-8"/>
       <w:r>
-        <w:t xml:space="preserve">
-Heading 8
-</w:t>
+        <w:t xml:space="preserve">Heading 8</w:t>
       </w:r>
       <w:bookmarkEnd w:id="28"/>
     </w:p>
@@ -154,9 +128,7 @@
       </w:pPr>
       <w:bookmarkStart w:id="29" w:name="heading-9"/>
       <w:r>
-        <w:t xml:space="preserve">
-Heading 9
-</w:t>
+        <w:t xml:space="preserve">Heading 9</w:t>
       </w:r>
       <w:bookmarkEnd w:id="29"/>
     </w:p>
@@ -165,9 +137,7 @@
         <w:pStyle w:val="FirstParagraph"/>
       </w:pPr>
       <w:r>
-        <w:t xml:space="preserve">
-First Paragraph.
-</w:t>
+        <w:t xml:space="preserve">First Paragraph.</w:t>
       </w:r>
     </w:p>
     <w:p>
@@ -175,54 +145,39 @@
         <w:pStyle w:val="BodyText"/>
       </w:pPr>
       <w:r>
-        <w:t xml:space="preserve">
-Body Text. Body Text Char.
-</w:t>
-      </w:r>
-      <w:r>
-        <w:t xml:space="preserve">
-</w:t>
+        <w:t xml:space="preserve">Body Text. Body Text Char.</w:t>
+      </w:r>
+      <w:r>
+        <w:t xml:space="preserve"> </w:t>
       </w:r>
       <w:r>
         <w:rPr>
           <w:rStyle w:val="VerbatimChar"/>
         </w:rPr>
-        <w:t xml:space="preserve">
-Verbatim Char
-</w:t>
-      </w:r>
-      <w:r>
-        <w:t xml:space="preserve">
-.
-</w:t>
-      </w:r>
-      <w:r>
-        <w:t xml:space="preserve">
-</w:t>
+        <w:t xml:space="preserve">Verbatim Char</w:t>
+      </w:r>
+      <w:r>
+        <w:t xml:space="preserve">.</w:t>
+      </w:r>
+      <w:r>
+        <w:t xml:space="preserve"> </w:t>
       </w:r>
       <w:hyperlink r:id="rId30">
         <w:r>
           <w:rPr>
             <w:rStyle w:val="Hyperlink"/>
           </w:rPr>
-          <w:t xml:space="preserve">
-Hyperlink
-</w:t>
+          <w:t xml:space="preserve">Hyperlink</w:t>
         </w:r>
       </w:hyperlink>
       <w:r>
-        <w:t xml:space="preserve">
-.
-</w:t>
-      </w:r>
-      <w:r>
-        <w:t xml:space="preserve">
-</w:t>
-      </w:r>
-      <w:r>
-        <w:t xml:space="preserve">
-Footnote.
-</w:t>
+        <w:t xml:space="preserve">.</w:t>
+      </w:r>
+      <w:r>
+        <w:t xml:space="preserve"> </w:t>
+      </w:r>
+      <w:r>
+        <w:t xml:space="preserve">Footnote.</w:t>
       </w:r>
       <w:r>
         <w:rPr>
@@ -236,9 +191,7 @@
         <w:pStyle w:val="BlockText"/>
       </w:pPr>
       <w:r>
-        <w:t xml:space="preserve">
-Block Text.
-</w:t>
+        <w:t xml:space="preserve">Block Text.</w:t>
       </w:r>
     </w:p>
     <w:p>
@@ -246,9 +199,7 @@
         <w:pStyle w:val="TableCaption"/>
       </w:pPr>
       <w:r>
-        <w:t xml:space="preserve">
-Table caption.
-</w:t>
+        <w:t xml:space="preserve">Table caption.</w:t>
       </w:r>
     </w:p>
     <w:tbl>
@@ -275,9 +226,7 @@
               <w:jc w:val="left"/>
             </w:pPr>
             <w:r>
-              <w:t xml:space="preserve">
-Table
-</w:t>
+              <w:t xml:space="preserve">Table</w:t>
             </w:r>
           </w:p>
         </w:tc>
@@ -294,9 +243,7 @@
               <w:jc w:val="left"/>
             </w:pPr>
             <w:r>
-              <w:t xml:space="preserve">
-Table
-</w:t>
+              <w:t xml:space="preserve">Table</w:t>
             </w:r>
           </w:p>
         </w:tc>
@@ -309,9 +256,7 @@
               <w:jc w:val="left"/>
             </w:pPr>
             <w:r>
-              <w:t xml:space="preserve">
-1
-</w:t>
+              <w:t xml:space="preserve">1</w:t>
             </w:r>
           </w:p>
         </w:tc>
@@ -322,9 +267,7 @@
               <w:jc w:val="left"/>
             </w:pPr>
             <w:r>
-              <w:t xml:space="preserve">
-2
-</w:t>
+              <w:t xml:space="preserve">2</w:t>
             </w:r>
           </w:p>
         </w:tc>
@@ -335,9 +278,7 @@
         <w:pStyle w:val="ImageCaption"/>
       </w:pPr>
       <w:r>
-        <w:t xml:space="preserve">
-Image Caption
-</w:t>
+        <w:t xml:space="preserve">Image Caption</w:t>
       </w:r>
     </w:p>
     <w:p>
@@ -345,9 +286,7 @@
         <w:pStyle w:val="DefinitionTerm"/>
       </w:pPr>
       <w:r>
-        <w:t xml:space="preserve">
-DefinitionTerm
-</w:t>
+        <w:t xml:space="preserve">DefinitionTerm</w:t>
       </w:r>
     </w:p>
     <w:p>
@@ -355,9 +294,7 @@
         <w:pStyle w:val="Definition"/>
       </w:pPr>
       <w:r>
-        <w:t xml:space="preserve">
-Definition
-</w:t>
+        <w:t xml:space="preserve">Definition</w:t>
       </w:r>
     </w:p>
     <w:p>
@@ -365,9 +302,7 @@
         <w:pStyle w:val="DefinitionTerm"/>
       </w:pPr>
       <w:r>
-        <w:t xml:space="preserve">
-DefinitionTerm
-</w:t>
+        <w:t xml:space="preserve">DefinitionTerm</w:t>
       </w:r>
     </w:p>
     <w:p>
@@ -375,15 +310,13 @@
         <w:pStyle w:val="Definition"/>
       </w:pPr>
       <w:r>
-        <w:t xml:space="preserve">
-Definition
-</w:t>
+        <w:t xml:space="preserve">Definition</w:t>
       </w:r>
     </w:p>
     <w:sectPr>
       <w:footerReference w:type="default" r:id="rIdFooterPage"/>
       <w:footnotePr>
-        <w:numRestart w:val="eachSect"/>
+        <w:numRestart w:val="continuous"/>
       </w:footnotePr>
       <w:pgSz w:w="12240" w:h="15840"/>
       <w:pgMar w:top="1440" w:right="1440" w:bottom="1440" w:left="1440" w:header="720" w:footer="720" w:gutter="0"/>
@@ -406,35 +339,35 @@
     </w:pPr>
     <w:r>
       <w:rPr>
-        <w:rFonts w:ascii="Liberation Serif" w:hAnsi="Liberation Serif"/>
+        <w:rFonts w:ascii="TeX Gyre Schola" w:hAnsi="TeX Gyre Schola"/>
         <w:sz w:val="28"/>
       </w:rPr>
       <w:fldChar w:fldCharType="begin"/>
     </w:r>
     <w:r>
       <w:rPr>
-        <w:rFonts w:ascii="Liberation Serif" w:hAnsi="Liberation Serif"/>
+        <w:rFonts w:ascii="TeX Gyre Schola" w:hAnsi="TeX Gyre Schola"/>
         <w:sz w:val="28"/>
       </w:rPr>
       <w:instrText xml:space="preserve"> PAGE </w:instrText>
     </w:r>
     <w:r>
       <w:rPr>
-        <w:rFonts w:ascii="Liberation Serif" w:hAnsi="Liberation Serif"/>
+        <w:rFonts w:ascii="TeX Gyre Schola" w:hAnsi="TeX Gyre Schola"/>
         <w:sz w:val="28"/>
       </w:rPr>
       <w:fldChar w:fldCharType="separate"/>
     </w:r>
     <w:r>
       <w:rPr>
-        <w:rFonts w:ascii="Liberation Serif" w:hAnsi="Liberation Serif"/>
+        <w:rFonts w:ascii="TeX Gyre Schola" w:hAnsi="TeX Gyre Schola"/>
         <w:sz w:val="28"/>
       </w:rPr>
       <w:t>1</w:t>
     </w:r>
     <w:r>
       <w:rPr>
-        <w:rFonts w:ascii="Liberation Serif" w:hAnsi="Liberation Serif"/>
+        <w:rFonts w:ascii="TeX Gyre Schola" w:hAnsi="TeX Gyre Schola"/>
         <w:sz w:val="28"/>
       </w:rPr>
       <w:fldChar w:fldCharType="end"/>
@@ -471,10 +404,15 @@
         <w:footnoteRef/>
       </w:r>
       <w:r>
-        <w:t xml:space="preserve"> </w:t>
-      </w:r>
-      <w:r>
-        <w:t xml:space="preserve">Footnote Text.</w:t>
+        <w:t>Footnote Text.</w:t>
+      </w:r>
+    </w:p>
+    <w:p>
+      <w:pPr>
+        <w:pStyle w:val="FootnoteBlockText"/>
+      </w:pPr>
+      <w:r>
+        <w:t>Footnote Block Text</w:t>
       </w:r>
     </w:p>
   </w:footnote>
@@ -597,7 +535,7 @@
   <w:docDefaults>
     <w:rPrDefault>
       <w:rPr>
-        <w:rFonts w:ascii="Liberation Serif" w:hAnsi="Liberation Serif" w:eastAsia="Liberation Serif" w:cs="Liberation Serif"/>
+        <w:rFonts w:ascii="TeX Gyre Schola" w:hAnsi="TeX Gyre Schola" w:eastAsia="TeX Gyre Schola" w:cs="TeX Gyre Schola"/>
         <w:sz w:val="28"/>
         <w:szCs w:val="28"/>
         <w:lang w:val="en-US" w:eastAsia="en-US" w:bidi="ar-SA"/>
@@ -614,11 +552,11 @@
     <w:name w:val="Normal"/>
     <w:qFormat/>
     <w:pPr>
-      <w:spacing w:before="0" w:after="0" w:line="480" w:lineRule="auto"/>
+      <w:spacing w:before="0" w:after="0" w:line="646" w:lineRule="exact"/>
       <w:ind w:firstLine="720"/>
     </w:pPr>
     <w:rPr>
-      <w:rFonts w:ascii="Liberation Serif" w:hAnsi="Liberation Serif" w:eastAsia="Liberation Serif" w:cs="Liberation Serif"/>
+      <w:rFonts w:ascii="TeX Gyre Schola" w:hAnsi="TeX Gyre Schola" w:eastAsia="TeX Gyre Schola" w:cs="TeX Gyre Schola"/>
       <w:sz w:val="28"/>
       <w:szCs w:val="28"/>
     </w:rPr>
@@ -628,7 +566,7 @@
     <w:basedOn w:val="Normal"/>
     <w:qFormat/>
     <w:pPr>
-      <w:spacing w:before="0" w:after="0" w:line="480" w:lineRule="auto"/>
+      <w:spacing w:before="0" w:after="0" w:line="646" w:lineRule="exact"/>
       <w:ind w:firstLine="720"/>
     </w:pPr>
   </w:style>
@@ -646,7 +584,7 @@
     <w:basedOn w:val="BodyText"/>
     <w:qFormat/>
     <w:pPr>
-      <w:spacing w:before="0" w:after="0" w:line="240" w:lineRule="auto"/>
+      <w:spacing w:before="0" w:after="0" w:line="400" w:lineRule="exact"/>
     </w:pPr>
   </w:style>
   <w:style w:type="paragraph" w:styleId="Title">
@@ -791,13 +729,13 @@
     <w:pPr>
       <w:keepNext/>
       <w:keepLines/>
-      <w:spacing w:before="240" w:after="240" w:line="240" w:lineRule="auto"/>
+      <w:spacing w:before="240" w:after="240" w:line="400" w:lineRule="exact"/>
       <w:ind w:firstLine="0"/>
       <w:jc w:val="center"/>
       <w:outlineLvl w:val="0"/>
     </w:pPr>
     <w:rPr>
-      <w:rFonts w:ascii="Liberation Serif" w:hAnsi="Liberation Serif" w:eastAsia="Liberation Serif" w:cs="Liberation Serif"/>
+      <w:rFonts w:ascii="TeX Gyre Schola" w:hAnsi="TeX Gyre Schola" w:eastAsia="TeX Gyre Schola" w:cs="TeX Gyre Schola"/>
       <w:b/>
       <w:bCs/>
       <w:caps/>
@@ -815,12 +753,12 @@
     <w:pPr>
       <w:keepNext/>
       <w:keepLines/>
-      <w:spacing w:before="240" w:after="160" w:line="240" w:lineRule="auto"/>
+      <w:spacing w:before="240" w:after="160" w:line="400" w:lineRule="exact"/>
       <w:ind w:firstLine="0"/>
       <w:outlineLvl w:val="1"/>
     </w:pPr>
     <w:rPr>
-      <w:rFonts w:ascii="Liberation Serif" w:hAnsi="Liberation Serif" w:eastAsia="Liberation Serif" w:cs="Liberation Serif"/>
+      <w:rFonts w:ascii="TeX Gyre Schola" w:hAnsi="TeX Gyre Schola" w:eastAsia="TeX Gyre Schola" w:cs="TeX Gyre Schola"/>
       <w:b/>
       <w:bCs/>
       <w:color w:val="000000"/>
@@ -837,12 +775,12 @@
     <w:pPr>
       <w:keepNext/>
       <w:keepLines/>
-      <w:spacing w:before="200" w:after="160" w:line="240" w:lineRule="auto"/>
+      <w:spacing w:before="200" w:after="160" w:line="400" w:lineRule="exact"/>
       <w:ind w:firstLine="0"/>
       <w:outlineLvl w:val="2"/>
     </w:pPr>
     <w:rPr>
-      <w:rFonts w:ascii="Liberation Serif" w:hAnsi="Liberation Serif" w:eastAsia="Liberation Serif" w:cs="Liberation Serif"/>
+      <w:rFonts w:ascii="TeX Gyre Schola" w:hAnsi="TeX Gyre Schola" w:eastAsia="TeX Gyre Schola" w:cs="TeX Gyre Schola"/>
       <w:b/>
       <w:bCs/>
       <w:i/>
@@ -1110,7 +1048,7 @@
     <w:uiPriority w:val="9"/>
     <w:qFormat/>
     <w:pPr>
-      <w:spacing w:before="0" w:after="240" w:line="240" w:lineRule="auto"/>
+      <w:spacing w:before="0" w:after="240" w:line="400" w:lineRule="exact"/>
       <w:ind w:firstLine="0" w:left="720" w:right="720"/>
     </w:pPr>
   </w:style>
@@ -1119,11 +1057,11 @@
     <w:basedOn w:val="Normal"/>
     <w:uiPriority w:val="9"/>
     <w:pPr>
-      <w:spacing w:before="0" w:after="120" w:line="240" w:lineRule="auto"/>
+      <w:spacing w:before="0" w:after="120" w:line="400" w:lineRule="exact"/>
       <w:ind w:firstLine="0"/>
     </w:pPr>
     <w:rPr>
-      <w:rFonts w:ascii="Liberation Serif" w:hAnsi="Liberation Serif" w:eastAsia="Liberation Serif" w:cs="Liberation Serif"/>
+      <w:rFonts w:ascii="TeX Gyre Schola" w:hAnsi="TeX Gyre Schola" w:eastAsia="TeX Gyre Schola" w:cs="TeX Gyre Schola"/>
       <w:sz w:val="28"/>
       <w:szCs w:val="28"/>
     </w:rPr>
@@ -1148,8 +1086,6 @@
   <w:style w:type="table" w:default="1" w:styleId="Table">
     <w:name w:val="Table"/>
     <w:basedOn w:val="TableNormal"/>
-    <w:semiHidden/>
-    <w:unhideWhenUsed/>
     <w:qFormat/>
     <w:tblPr>
       <w:tblInd w:w="0" w:type="dxa"/>
@@ -1161,13 +1097,6 @@
       </w:tblCellMar>
     </w:tblPr>
     <w:tblStylePr w:type="firstRow">
-      <w:tblPr>
-        <w:jc w:val="left"/>
-        <w:tblInd w:w="0" w:type="dxa"/>
-      </w:tblPr>
-      <w:trPr>
-        <w:jc w:val="left"/>
-      </w:trPr>
       <w:tcPr>
         <w:tcBorders>
           <w:bottom w:val="single"/>

</xml_diff>